<commit_message>
Add new page + update CV + portfolio enhancements
</commit_message>
<xml_diff>
--- a/Mujtaba_khalid-cv.docx
+++ b/Mujtaba_khalid-cv.docx
@@ -5,6 +5,7 @@
     <w:p>
       <w:pPr>
         <w:pStyle w:val="para3"/>
+        <w:ind w:firstLine="720"/>
         <w:spacing/>
         <w:jc w:val="center"/>
         <w:rPr>
@@ -36,6 +37,23 @@
     </w:p>
     <w:p>
       <w:pPr>
+        <w:spacing/>
+        <w:jc w:val="center"/>
+      </w:pPr>
+      <w:r>
+        <w:t xml:space="preserve">Portfolio: </w:t>
+      </w:r>
+      <w:hyperlink r:id="rId8" w:history="1">
+        <w:r>
+          <w:rPr>
+            <w:rStyle w:val="char27"/>
+          </w:rPr>
+          <w:t>https://mujtaba-k-mohammed.github.io/portfolio/</w:t>
+        </w:r>
+      </w:hyperlink>
+    </w:p>
+    <w:p>
+      <w:pPr>
         <w:rPr>
           <w:b/>
           <w:bCs/>
@@ -55,7 +73,15 @@
     </w:p>
     <w:p>
       <w:r>
-        <w:t>Software Engineering graduate with strong front-end development skills and hands-on experience building responsive, user-friendly web interfaces using HTML, CSS, JavaScript, and React. Skilled in consuming REST APIs, handling JSON data, and implementing CRUD operations using Fetch API and Axios. Experienced with Git/GitHub and modern development workflows. Passionate about creating clean, modern digital experiences and continuously improving technical abilities while contributing to real-world projects.</w:t>
+        <w:t>Software Engineering graduate with 3+ year of hands</w:t>
+        <w:noBreakHyphen/>
+        <w:t>on front</w:t>
+        <w:noBreakHyphen/>
+        <w:t>end experience building responsive, user</w:t>
+        <w:noBreakHyphen/>
+        <w:t>friendly web interfaces for startups and internal operations tools. Proficient in HTML, CSS, JavaScript, React, and REST API integration.Delivered UI improvements that reduced page load times and fixed production bugs while collaborating with cross</w:t>
+        <w:noBreakHyphen/>
+        <w:t>functional teams.</w:t>
       </w:r>
     </w:p>
     <w:p>
@@ -74,37 +100,55 @@
           <w:sz w:val="24"/>
           <w:szCs w:val="24"/>
         </w:rPr>
-        <w:t>Projects &amp; Freelance Work</w:t>
+        <w:t xml:space="preserve">Projects </w:t>
       </w:r>
     </w:p>
     <w:p>
       <w:pPr>
+        <w:pBdr>
+          <w:top w:val="nil" w:sz="0" w:space="0" w:color="000000" tmln="20, 20, 20, 0, 0"/>
+          <w:left w:val="nil" w:sz="0" w:space="0" w:color="000000" tmln="20, 20, 20, 0, 0"/>
+          <w:bottom w:val="nil" w:sz="0" w:space="0" w:color="000000" tmln="20, 20, 20, 0, 0"/>
+          <w:right w:val="nil" w:sz="0" w:space="0" w:color="000000" tmln="20, 20, 20, 0, 0"/>
+          <w:between w:val="nil" w:sz="0" w:space="0" w:color="000000" tmln="20, 20, 20, 0, 0"/>
+        </w:pBdr>
+        <w:shd w:val="none"/>
+      </w:pPr>
+      <w:r>
         <w:rPr>
-          <w:rFonts w:ascii="Calibri" w:hAnsi="Calibri" w:eastAsia="ＭＳ ゴシック"/>
+          <w:rFonts w:ascii="Calibri" w:hAnsi="Calibri" w:eastAsia="ＭＳ ゴシック" w:hint="cs"/>
           <w:color w:val="000000"/>
         </w:rPr>
-      </w:pPr>
+        <w:t>1</w:t>
+      </w:r>
       <w:r>
         <w:rPr>
           <w:rFonts w:ascii="Calibri" w:hAnsi="Calibri" w:eastAsia="ＭＳ ゴシック"/>
           <w:color w:val="000000"/>
         </w:rPr>
-        <w:t>1) Portfolio Website – HTML, CSS, JavaScript</w:t>
+        <w:t>)</w:t>
+      </w:r>
+      <w:r>
+        <w:t>Portfolio Website</w:t>
       </w:r>
     </w:p>
     <w:p>
-      <w:pPr>
+      <w:r>
         <w:rPr>
-          <w:rFonts w:ascii="Calibri" w:hAnsi="Calibri" w:eastAsia="ＭＳ ゴシック"/>
+          <w:rFonts w:ascii="Calibri" w:hAnsi="Calibri" w:eastAsia="ＭＳ ゴシック" w:hint="cs"/>
           <w:color w:val="000000"/>
         </w:rPr>
-      </w:pPr>
+        <w:t>2</w:t>
+      </w:r>
       <w:r>
         <w:rPr>
           <w:rFonts w:ascii="Calibri" w:hAnsi="Calibri" w:eastAsia="ＭＳ ゴシック"/>
           <w:color w:val="000000"/>
         </w:rPr>
-        <w:t>2) Avatar Landing Page – HTML, CSS, JavaScript</w:t>
+        <w:t xml:space="preserve">) </w:t>
+      </w:r>
+      <w:r>
+        <w:t>WordPress Website</w:t>
       </w:r>
     </w:p>
     <w:p>
@@ -114,12 +158,19 @@
           <w:color w:val="000000"/>
         </w:rPr>
       </w:pPr>
+      <w:r>
+        <w:rPr>
+          <w:rFonts w:ascii="Calibri" w:hAnsi="Calibri" w:eastAsia="ＭＳ ゴシック" w:hint="cs"/>
+          <w:color w:val="000000"/>
+        </w:rPr>
+        <w:t>3</w:t>
+      </w:r>
       <w:r>
         <w:rPr>
           <w:rFonts w:ascii="Calibri" w:hAnsi="Calibri" w:eastAsia="ＭＳ ゴシック"/>
           <w:color w:val="000000"/>
         </w:rPr>
-        <w:t>3) Product Landing Page – HTML, CSS, JavaScript</w:t>
+        <w:t>) Avatar Landing Page</w:t>
       </w:r>
     </w:p>
     <w:p>
@@ -129,12 +180,41 @@
           <w:color w:val="000000"/>
         </w:rPr>
       </w:pPr>
+      <w:r>
+        <w:rPr>
+          <w:rFonts w:ascii="Calibri" w:hAnsi="Calibri" w:eastAsia="ＭＳ ゴシック" w:hint="cs"/>
+          <w:color w:val="000000"/>
+        </w:rPr>
+        <w:t>4</w:t>
+      </w:r>
       <w:r>
         <w:rPr>
           <w:rFonts w:ascii="Calibri" w:hAnsi="Calibri" w:eastAsia="ＭＳ ゴシック"/>
           <w:color w:val="000000"/>
         </w:rPr>
-        <w:t>4) Services Website – HTML, CSS, JavaScript</w:t>
+        <w:t>) Product Landing Page</w:t>
+      </w:r>
+    </w:p>
+    <w:p>
+      <w:pPr>
+        <w:rPr>
+          <w:rFonts w:ascii="Calibri" w:hAnsi="Calibri" w:eastAsia="ＭＳ ゴシック"/>
+          <w:color w:val="000000"/>
+        </w:rPr>
+      </w:pPr>
+      <w:r>
+        <w:rPr>
+          <w:rFonts w:ascii="Calibri" w:hAnsi="Calibri" w:eastAsia="ＭＳ ゴシック" w:hint="cs"/>
+          <w:color w:val="000000"/>
+        </w:rPr>
+        <w:t>5</w:t>
+      </w:r>
+      <w:r>
+        <w:rPr>
+          <w:rFonts w:ascii="Calibri" w:hAnsi="Calibri" w:eastAsia="ＭＳ ゴシック"/>
+          <w:color w:val="000000"/>
+        </w:rPr>
+        <w:t xml:space="preserve">) Services Website </w:t>
       </w:r>
     </w:p>
     <w:p>
@@ -149,7 +229,7 @@
         </w:pBdr>
         <w:shd w:val="none"/>
         <w:rPr>
-          <w:rFonts w:ascii="Courier New" w:hAnsi="Courier New" w:eastAsia="ＭＳ 明朝"/>
+          <w:rFonts w:eastAsia="Calibri" w:cs="Calibri"/>
           <w:b w:val="0"/>
           <w:bCs w:val="0"/>
           <w:color w:val="auto"/>
@@ -161,7 +241,15 @@
           <w:bCs w:val="0"/>
           <w:color w:val="000000"/>
         </w:rPr>
-        <w:t>5)</w:t>
+        <w:t>6</w:t>
+      </w:r>
+      <w:r>
+        <w:rPr>
+          <w:b w:val="0"/>
+          <w:bCs w:val="0"/>
+          <w:color w:val="000000"/>
+        </w:rPr>
+        <w:t>)</w:t>
       </w:r>
       <w:r>
         <w:rPr>
@@ -170,41 +258,7 @@
           <w:bCs w:val="0"/>
           <w:color w:val="auto"/>
         </w:rPr>
-        <w:t>React CRUD Posts App – React.js + REST API</w:t>
-      </w:r>
-      <w:r>
-        <w:rPr>
-          <w:rFonts w:ascii="Courier New" w:hAnsi="Courier New" w:eastAsia="ＭＳ 明朝"/>
-          <w:b w:val="0"/>
-          <w:bCs w:val="0"/>
-          <w:color w:val="auto"/>
-        </w:rPr>
-      </w:r>
-    </w:p>
-    <w:p>
-      <w:pPr>
-        <w:pStyle w:val="para5"/>
-        <w:pBdr>
-          <w:top w:val="nil" w:sz="0" w:space="0" w:color="000000" tmln="20, 20, 20, 0, 0"/>
-          <w:left w:val="nil" w:sz="0" w:space="0" w:color="000000" tmln="20, 20, 20, 0, 0"/>
-          <w:bottom w:val="nil" w:sz="0" w:space="0" w:color="000000" tmln="20, 20, 20, 0, 0"/>
-          <w:right w:val="nil" w:sz="0" w:space="0" w:color="000000" tmln="20, 20, 20, 0, 0"/>
-          <w:between w:val="nil" w:sz="0" w:space="0" w:color="000000" tmln="20, 20, 20, 0, 0"/>
-        </w:pBdr>
-        <w:shd w:val="none"/>
-        <w:rPr>
-          <w:b w:val="0"/>
-          <w:bCs w:val="0"/>
-          <w:color w:val="000000"/>
-        </w:rPr>
-      </w:pPr>
-      <w:r>
-        <w:rPr>
-          <w:b w:val="0"/>
-          <w:bCs w:val="0"/>
-          <w:color w:val="000000"/>
-        </w:rPr>
-        <w:t>6) Software Defect Prediction – Graduation Project (Machine Learning).</w:t>
+        <w:t xml:space="preserve">React CRUD Posts App </w:t>
       </w:r>
     </w:p>
     <w:p>
@@ -275,7 +329,7 @@
           <w:bCs/>
           <w:color w:val="000000"/>
         </w:rPr>
-        <w:t>Front-End Development Trainee – Umm Al Quwain, United Arab Emirates</w:t>
+        <w:t>Front-End Development  –Brandegic Company(Umm Al Quwain)</w:t>
       </w:r>
     </w:p>
     <w:p>
@@ -333,7 +387,7 @@
           <w:bCs/>
           <w:szCs w:val="28"/>
         </w:rPr>
-        <w:t>–  Now</w:t>
+        <w:t xml:space="preserve">–  </w:t>
       </w:r>
       <w:r>
         <w:rPr>
@@ -341,6 +395,7 @@
           <w:bCs/>
           <w:szCs w:val="28"/>
         </w:rPr>
+        <w:t>2026</w:t>
       </w:r>
     </w:p>
     <w:p>
@@ -358,6 +413,11 @@
           <w:between w:val="nil" w:sz="0" w:space="0" w:color="000000" tmln="20, 20, 20, 0, 0"/>
         </w:pBdr>
         <w:shd w:val="none"/>
+        <w:rPr>
+          <w:rFonts w:cs="Arial"/>
+          <w:bCs/>
+          <w:szCs w:val="28"/>
+        </w:rPr>
       </w:pPr>
       <w:r>
         <w:rPr>
@@ -365,9 +425,8 @@
           <w:bCs/>
           <w:szCs w:val="28"/>
         </w:rPr>
-        <w:t>Worked on front-end tasks including building responsive layouts and improving UI components.</w:t>
+        <w:t>Built responsive layouts and improved UI components for 4 internal pages, improving mobile usability by 40%.</w:t>
       </w:r>
-      <w:r/>
     </w:p>
     <w:p>
       <w:pPr>
@@ -384,6 +443,11 @@
           <w:between w:val="nil" w:sz="0" w:space="0" w:color="000000" tmln="20, 20, 20, 0, 0"/>
         </w:pBdr>
         <w:shd w:val="none"/>
+        <w:rPr>
+          <w:rFonts w:cs="Arial"/>
+          <w:bCs/>
+          <w:szCs w:val="28"/>
+        </w:rPr>
       </w:pPr>
       <w:r>
         <w:rPr>
@@ -391,9 +455,8 @@
           <w:bCs/>
           <w:szCs w:val="28"/>
         </w:rPr>
-        <w:t>Practiced API integration using Fetch API .</w:t>
+        <w:t>Implemented REST API integration using Fetch API to load dynamic content; added error and loading states to improve UX and reduce failed requests by 30%.</w:t>
       </w:r>
-      <w:r/>
     </w:p>
     <w:p>
       <w:pPr>
@@ -436,6 +499,11 @@
           <w:between w:val="nil" w:sz="0" w:space="0" w:color="000000" tmln="20, 20, 20, 0, 0"/>
         </w:pBdr>
         <w:shd w:val="none"/>
+        <w:rPr>
+          <w:rFonts w:cs="Arial"/>
+          <w:bCs/>
+          <w:szCs w:val="28"/>
+        </w:rPr>
       </w:pPr>
       <w:r>
         <w:rPr>
@@ -443,9 +511,12 @@
           <w:bCs/>
           <w:szCs w:val="28"/>
         </w:rPr>
-        <w:t>Assisted in debugging and testing web pages across different devices.</w:t>
+        <w:t>Debugged cross</w:t>
+        <w:noBreakHyphen/>
+        <w:t>browser/device issues and reduced reported front</w:t>
+        <w:noBreakHyphen/>
+        <w:t>end bugs by 20% through targeted fixes and testing</w:t>
       </w:r>
-      <w:r/>
     </w:p>
     <w:p>
       <w:pPr>
@@ -469,7 +540,7 @@
           <w:bCs/>
           <w:szCs w:val="28"/>
         </w:rPr>
-        <w:t>Learned professional communication, teamwork, and workplace discipline in a UAE environment.</w:t>
+        <w:t>teamwork, and workplace discipline in a UAE environment.</w:t>
       </w:r>
       <w:r/>
     </w:p>
@@ -565,7 +636,23 @@
           <w:bCs/>
           <w:szCs w:val="28"/>
         </w:rPr>
-        <w:t xml:space="preserve">2024 </w:t>
+        <w:t>202</w:t>
+      </w:r>
+      <w:r>
+        <w:rPr>
+          <w:rFonts w:cs="Arial"/>
+          <w:bCs/>
+          <w:szCs w:val="28"/>
+        </w:rPr>
+        <w:t>3</w:t>
+      </w:r>
+      <w:r>
+        <w:rPr>
+          <w:rFonts w:cs="Arial" w:hint="cs"/>
+          <w:bCs/>
+          <w:szCs w:val="28"/>
+        </w:rPr>
+        <w:t xml:space="preserve"> </w:t>
       </w:r>
       <w:r>
         <w:rPr>
@@ -607,6 +694,11 @@
           <w:between w:val="nil" w:sz="0" w:space="0" w:color="000000" tmln="20, 20, 20, 0, 0"/>
         </w:pBdr>
         <w:shd w:val="none"/>
+        <w:rPr>
+          <w:rFonts w:cs="Arial"/>
+          <w:bCs/>
+          <w:szCs w:val="28"/>
+        </w:rPr>
       </w:pPr>
       <w:r>
         <w:rPr>
@@ -614,9 +706,8 @@
           <w:bCs/>
           <w:szCs w:val="28"/>
         </w:rPr>
-        <w:t>Developed and maintained user interfaces for internal web tools used by the operations team.</w:t>
+        <w:t>Managed and maintained the company’s web pages, including content updates and layout adjustments.</w:t>
       </w:r>
-      <w:r/>
     </w:p>
     <w:p>
       <w:pPr>
@@ -633,6 +724,11 @@
           <w:between w:val="nil" w:sz="0" w:space="0" w:color="000000" tmln="20, 20, 20, 0, 0"/>
         </w:pBdr>
         <w:shd w:val="none"/>
+        <w:rPr>
+          <w:rFonts w:cs="Arial"/>
+          <w:bCs/>
+          <w:szCs w:val="28"/>
+        </w:rPr>
       </w:pPr>
       <w:r>
         <w:rPr>
@@ -640,9 +736,10 @@
           <w:bCs/>
           <w:szCs w:val="28"/>
         </w:rPr>
-        <w:t>Built responsive pages using HTML, CSS, and JavaScript.</w:t>
+        <w:t>Diagnosed and fixed front</w:t>
+        <w:noBreakHyphen/>
+        <w:t>end issues using browser dev tools and error logs, resolving functional and visual bugs.</w:t>
       </w:r>
-      <w:r/>
     </w:p>
     <w:p>
       <w:pPr>
@@ -659,6 +756,11 @@
           <w:between w:val="nil" w:sz="0" w:space="0" w:color="000000" tmln="20, 20, 20, 0, 0"/>
         </w:pBdr>
         <w:shd w:val="none"/>
+        <w:rPr>
+          <w:rFonts w:cs="Arial"/>
+          <w:bCs/>
+          <w:szCs w:val="28"/>
+        </w:rPr>
       </w:pPr>
       <w:r>
         <w:rPr>
@@ -666,9 +768,8 @@
           <w:bCs/>
           <w:szCs w:val="28"/>
         </w:rPr>
-        <w:t>Improved UI/UX for driver and customer dashboards.</w:t>
+        <w:t>Performed routine maintenance and updates on the WordPress site, including plugin updates, backups, and security patches.</w:t>
       </w:r>
-      <w:r/>
     </w:p>
     <w:p>
       <w:pPr>
@@ -685,6 +786,11 @@
           <w:between w:val="nil" w:sz="0" w:space="0" w:color="000000" tmln="20, 20, 20, 0, 0"/>
         </w:pBdr>
         <w:shd w:val="none"/>
+        <w:rPr>
+          <w:rFonts w:cs="Arial"/>
+          <w:bCs/>
+          <w:szCs w:val="28"/>
+        </w:rPr>
       </w:pPr>
       <w:r>
         <w:rPr>
@@ -692,9 +798,8 @@
           <w:bCs/>
           <w:szCs w:val="28"/>
         </w:rPr>
-        <w:t>Fixed front-end bugs and optimized page performance.</w:t>
+        <w:t>Implemented responsive design fixes to ensure consistent display across major devices and browsers.</w:t>
       </w:r>
-      <w:r/>
     </w:p>
     <w:p>
       <w:pPr>
@@ -711,6 +816,11 @@
           <w:between w:val="nil" w:sz="0" w:space="0" w:color="000000" tmln="20, 20, 20, 0, 0"/>
         </w:pBdr>
         <w:shd w:val="none"/>
+        <w:rPr>
+          <w:rFonts w:cs="Arial"/>
+          <w:bCs/>
+          <w:szCs w:val="28"/>
+        </w:rPr>
       </w:pPr>
       <w:r>
         <w:rPr>
@@ -718,9 +828,8 @@
           <w:bCs/>
           <w:szCs w:val="28"/>
         </w:rPr>
-        <w:t>Collaborated with backend and operations teams to enhance platform usability.</w:t>
+        <w:t>Optimized page assets by compressing images and minifying CSS/JS, reducing average page load time by 20%.</w:t>
       </w:r>
-      <w:r/>
     </w:p>
     <w:p>
       <w:pPr>
@@ -737,6 +846,11 @@
           <w:between w:val="nil" w:sz="0" w:space="0" w:color="000000" tmln="20, 20, 20, 0, 0"/>
         </w:pBdr>
         <w:shd w:val="none"/>
+        <w:rPr>
+          <w:rFonts w:cs="Arial"/>
+          <w:bCs/>
+          <w:szCs w:val="28"/>
+        </w:rPr>
       </w:pPr>
       <w:r>
         <w:rPr>
@@ -744,33 +858,8 @@
           <w:bCs/>
           <w:szCs w:val="28"/>
         </w:rPr>
-        <w:t>Worked with Git/GitHub for version control and code updates.</w:t>
-      </w:r>
-      <w:r/>
-    </w:p>
-    <w:p>
-      <w:pPr>
-        <w:numPr>
-          <w:ilvl w:val="0"/>
-          <w:numId w:val="16"/>
-        </w:numPr>
-        <w:ind w:left="360" w:hanging="360"/>
-        <w:pBdr>
-          <w:top w:val="nil" w:sz="0" w:space="0" w:color="000000" tmln="20, 20, 20, 0, 0"/>
-          <w:left w:val="nil" w:sz="0" w:space="0" w:color="000000" tmln="20, 20, 20, 0, 0"/>
-          <w:bottom w:val="nil" w:sz="0" w:space="0" w:color="000000" tmln="20, 20, 20, 0, 0"/>
-          <w:right w:val="nil" w:sz="0" w:space="0" w:color="000000" tmln="20, 20, 20, 0, 0"/>
-          <w:between w:val="nil" w:sz="0" w:space="0" w:color="000000" tmln="20, 20, 20, 0, 0"/>
-        </w:pBdr>
-        <w:shd w:val="none"/>
-      </w:pPr>
-      <w:r>
-        <w:rPr>
-          <w:rFonts w:cs="Arial"/>
-          <w:bCs/>
-          <w:szCs w:val="28"/>
-        </w:rPr>
-        <w:t>Gained practical experience in real-world front-end development and problem-solving.</w:t>
+        <w:t>Monitored site performance and error reports</w:t>
+        <w:tab/>
       </w:r>
     </w:p>
     <w:p>
@@ -792,10 +881,10 @@
         <w:rPr>
           <w:b/>
           <w:bCs/>
-          <w:sz w:val="28"/>
-          <w:szCs w:val="28"/>
+          <w:sz w:val="24"/>
+          <w:szCs w:val="24"/>
         </w:rPr>
-        <w:t>Eductaion</w:t>
+        <w:t>Education</w:t>
       </w:r>
       <w:r>
         <w:rPr>
@@ -864,209 +953,6 @@
     </w:p>
     <w:p>
       <w:pPr>
-        <w:rPr>
-          <w:b/>
-          <w:bCs/>
-          <w:sz w:val="24"/>
-          <w:szCs w:val="24"/>
-        </w:rPr>
-      </w:pPr>
-      <w:r>
-        <w:rPr>
-          <w:b/>
-          <w:bCs/>
-          <w:sz w:val="24"/>
-          <w:szCs w:val="24"/>
-        </w:rPr>
-        <w:t>Skills</w:t>
-      </w:r>
-    </w:p>
-    <w:p>
-      <w:pPr>
-        <w:rPr>
-          <w:rFonts w:ascii="Calibri" w:hAnsi="Calibri" w:eastAsia="ＭＳ ゴシック"/>
-          <w:b/>
-          <w:bCs/>
-          <w:color w:val="000000"/>
-        </w:rPr>
-      </w:pPr>
-      <w:r>
-        <w:rPr>
-          <w:rFonts w:ascii="Calibri" w:hAnsi="Calibri" w:eastAsia="ＭＳ ゴシック"/>
-          <w:b/>
-          <w:bCs/>
-          <w:color w:val="000000"/>
-        </w:rPr>
-        <w:t>Front-End Development</w:t>
-      </w:r>
-    </w:p>
-    <w:p>
-      <w:pPr>
-        <w:rPr>
-          <w:rFonts w:cs="Arial"/>
-          <w:bCs/>
-          <w:szCs w:val="28"/>
-        </w:rPr>
-      </w:pPr>
-      <w:r>
-        <w:rPr>
-          <w:rFonts w:cs="Arial"/>
-          <w:bCs/>
-          <w:szCs w:val="28"/>
-        </w:rPr>
-        <w:t>HTML, CSS ,  JavaScript,  React.js, Responsive Web Design, Flexbox, CSS Grid, DOM Manipulation, UI/UX Basics</w:t>
-      </w:r>
-    </w:p>
-    <w:p>
-      <w:pPr>
-        <w:rPr>
-          <w:rFonts w:ascii="Calibri" w:hAnsi="Calibri" w:eastAsia="ＭＳ ゴシック"/>
-          <w:b/>
-          <w:bCs/>
-          <w:color w:val="000000"/>
-        </w:rPr>
-      </w:pPr>
-      <w:r>
-        <w:rPr>
-          <w:rFonts w:ascii="Calibri" w:hAnsi="Calibri" w:eastAsia="ＭＳ ゴシック"/>
-          <w:b/>
-          <w:bCs/>
-          <w:color w:val="000000"/>
-        </w:rPr>
-        <w:t>API &amp; Data Handling</w:t>
-      </w:r>
-    </w:p>
-    <w:p>
-      <w:pPr>
-        <w:rPr>
-          <w:rFonts w:cs="Arial"/>
-          <w:bCs/>
-          <w:szCs w:val="28"/>
-        </w:rPr>
-      </w:pPr>
-      <w:r>
-        <w:rPr>
-          <w:rFonts w:cs="Arial"/>
-          <w:bCs/>
-          <w:szCs w:val="28"/>
-        </w:rPr>
-        <w:t>REST API Integration, Fetch API, JSON Handling, CRUD Operations (GET, POST, PUT, DELETE), Error Handling, Postman, Cookies &amp; Session Storage, Asynchronous JavaScript (Promises, Async/Await)</w:t>
-      </w:r>
-    </w:p>
-    <w:p>
-      <w:pPr>
-        <w:rPr>
-          <w:rFonts w:ascii="Calibri" w:hAnsi="Calibri" w:eastAsia="ＭＳ ゴシック"/>
-          <w:b/>
-          <w:bCs/>
-          <w:color w:val="000000"/>
-        </w:rPr>
-      </w:pPr>
-      <w:r>
-        <w:rPr>
-          <w:rFonts w:ascii="Calibri" w:hAnsi="Calibri" w:eastAsia="ＭＳ ゴシック"/>
-          <w:b/>
-          <w:bCs/>
-          <w:color w:val="000000"/>
-        </w:rPr>
-        <w:t>Tools &amp; Workflow</w:t>
-      </w:r>
-    </w:p>
-    <w:p>
-      <w:pPr>
-        <w:rPr>
-          <w:rFonts w:cs="Arial"/>
-          <w:bCs/>
-          <w:szCs w:val="28"/>
-        </w:rPr>
-      </w:pPr>
-      <w:r>
-        <w:rPr>
-          <w:rFonts w:cs="Arial"/>
-          <w:bCs/>
-          <w:szCs w:val="28"/>
-        </w:rPr>
-        <w:t>Git, GitHub, Git Workflow, VS Code, Debugging, Web Development Principles, Website Optimization, Cross-Browser Compatibility</w:t>
-      </w:r>
-    </w:p>
-    <w:p>
-      <w:pPr>
-        <w:rPr>
-          <w:b/>
-          <w:bCs/>
-          <w:sz w:val="24"/>
-          <w:szCs w:val="24"/>
-        </w:rPr>
-      </w:pPr>
-      <w:r>
-        <w:rPr>
-          <w:b/>
-          <w:bCs/>
-          <w:sz w:val="24"/>
-          <w:szCs w:val="24"/>
-        </w:rPr>
-        <w:t>Soft Skills</w:t>
-      </w:r>
-    </w:p>
-    <w:p>
-      <w:pPr>
-        <w:pBdr>
-          <w:top w:val="nil" w:sz="0" w:space="0" w:color="000000" tmln="20, 20, 20, 0, 0"/>
-          <w:left w:val="nil" w:sz="0" w:space="0" w:color="000000" tmln="20, 20, 20, 0, 0"/>
-          <w:bottom w:val="nil" w:sz="0" w:space="0" w:color="000000" tmln="20, 20, 20, 0, 0"/>
-          <w:right w:val="nil" w:sz="0" w:space="0" w:color="000000" tmln="20, 20, 20, 0, 0"/>
-          <w:between w:val="nil" w:sz="0" w:space="0" w:color="000000" tmln="20, 20, 20, 0, 0"/>
-        </w:pBdr>
-        <w:shd w:val="none"/>
-      </w:pPr>
-      <w:r>
-        <w:t>Teamwork , Communication , Problem Solving , Time Management , Adaptability , Fast Learning , Attention to Detail , Professionalism , Critical Thinking</w:t>
-      </w:r>
-    </w:p>
-    <w:p>
-      <w:pPr>
-        <w:pStyle w:val="para4"/>
-        <w:pBdr>
-          <w:top w:val="nil" w:sz="0" w:space="0" w:color="000000" tmln="20, 20, 20, 0, 0"/>
-          <w:left w:val="nil" w:sz="0" w:space="0" w:color="000000" tmln="20, 20, 20, 0, 0"/>
-          <w:bottom w:val="nil" w:sz="0" w:space="0" w:color="000000" tmln="20, 20, 20, 0, 0"/>
-          <w:right w:val="nil" w:sz="0" w:space="0" w:color="000000" tmln="20, 20, 20, 0, 0"/>
-          <w:between w:val="nil" w:sz="0" w:space="0" w:color="000000" tmln="20, 20, 20, 0, 0"/>
-        </w:pBdr>
-        <w:shd w:val="none"/>
-        <w:rPr>
-          <w:rFonts w:ascii="Times New Roman" w:hAnsi="Times New Roman" w:eastAsia="ＭＳ 明朝" w:cs="Arial"/>
-          <w:b w:val="0"/>
-          <w:color w:val="000000"/>
-          <w:sz w:val="20"/>
-          <w:szCs w:val="32"/>
-        </w:rPr>
-      </w:pPr>
-      <w:r>
-        <w:rPr>
-          <w:color w:val="000000"/>
-          <w:sz w:val="24"/>
-          <w:szCs w:val="24"/>
-        </w:rPr>
-        <w:t>Languages</w:t>
-      </w:r>
-      <w:r>
-        <w:rPr>
-          <w:rFonts w:ascii="Times New Roman" w:hAnsi="Times New Roman" w:eastAsia="ＭＳ 明朝" w:cs="Arial"/>
-          <w:b w:val="0"/>
-          <w:color w:val="000000"/>
-          <w:sz w:val="20"/>
-          <w:szCs w:val="32"/>
-        </w:rPr>
-      </w:r>
-    </w:p>
-    <w:p>
-      <w:pPr>
-        <w:numPr>
-          <w:ilvl w:val="0"/>
-          <w:numId w:val="15"/>
-        </w:numPr>
-        <w:ind w:left="283" w:hanging="283"/>
         <w:keepNext/>
         <w:keepLines/>
         <w:pBdr>
@@ -1079,9 +965,214 @@
         <w:shd w:val="none"/>
         <w:rPr>
           <w:rFonts w:cs="Arial"/>
+          <w:bCs/>
+          <w:szCs w:val="28"/>
+        </w:rPr>
+      </w:pPr>
+      <w:r>
+        <w:rPr>
+          <w:rFonts w:cs="Arial"/>
+          <w:b/>
+          <w:bCs/>
+          <w:szCs w:val="28"/>
+        </w:rPr>
+        <w:t>GPA</w:t>
+      </w:r>
+      <w:r>
+        <w:rPr>
+          <w:rFonts w:cs="Arial"/>
+          <w:bCs/>
+          <w:szCs w:val="28"/>
+        </w:rPr>
+        <w:t>: [3.30]</w:t>
+      </w:r>
+    </w:p>
+    <w:p>
+      <w:pPr>
+        <w:rPr>
+          <w:b/>
+          <w:bCs/>
+          <w:sz w:val="24"/>
+          <w:szCs w:val="24"/>
+        </w:rPr>
+      </w:pPr>
+      <w:r>
+        <w:rPr>
+          <w:b/>
+          <w:bCs/>
+          <w:sz w:val="24"/>
+          <w:szCs w:val="24"/>
+        </w:rPr>
+        <w:t>Skills</w:t>
+      </w:r>
+    </w:p>
+    <w:p>
+      <w:pPr>
+        <w:rPr>
+          <w:rFonts w:ascii="Calibri" w:hAnsi="Calibri" w:eastAsia="ＭＳ ゴシック"/>
+          <w:b/>
+          <w:bCs/>
+          <w:color w:val="000000"/>
+        </w:rPr>
+      </w:pPr>
+      <w:r>
+        <w:rPr>
+          <w:rFonts w:ascii="Calibri" w:hAnsi="Calibri" w:eastAsia="ＭＳ ゴシック"/>
+          <w:b/>
+          <w:bCs/>
+          <w:color w:val="000000"/>
+        </w:rPr>
+        <w:t>Front-End:</w:t>
+      </w:r>
+    </w:p>
+    <w:p>
+      <w:pPr>
+        <w:rPr>
+          <w:rFonts w:cs="Arial"/>
+          <w:bCs/>
+          <w:szCs w:val="28"/>
+        </w:rPr>
+      </w:pPr>
+      <w:r>
+        <w:rPr>
+          <w:rFonts w:cs="Arial"/>
+          <w:bCs/>
+          <w:szCs w:val="28"/>
+        </w:rPr>
+        <w:t>HTML, CSS, JavaScript, React.js, Responsive Design, Flexbox, CSS Grid, Tailwind CSS</w:t>
+      </w:r>
+    </w:p>
+    <w:p>
+      <w:pPr>
+        <w:rPr>
+          <w:rFonts w:ascii="Calibri" w:hAnsi="Calibri" w:eastAsia="ＭＳ ゴシック"/>
+          <w:b/>
+          <w:bCs/>
+          <w:color w:val="000000"/>
+        </w:rPr>
+      </w:pPr>
+      <w:r>
+        <w:rPr>
+          <w:rFonts w:ascii="Calibri" w:hAnsi="Calibri" w:eastAsia="ＭＳ ゴシック"/>
+          <w:b/>
+          <w:bCs/>
+          <w:color w:val="000000"/>
+        </w:rPr>
+        <w:t>API &amp; Data Handling:</w:t>
+      </w:r>
+    </w:p>
+    <w:p>
+      <w:pPr>
+        <w:rPr>
+          <w:rFonts w:cs="Arial"/>
+          <w:bCs/>
+          <w:szCs w:val="28"/>
+        </w:rPr>
+      </w:pPr>
+      <w:r>
+        <w:rPr>
+          <w:rFonts w:cs="Arial"/>
+          <w:bCs/>
+          <w:szCs w:val="28"/>
+        </w:rPr>
+        <w:t>Fetch API, Axios, REST APIs, JSON, CRUD, Async/Await, Postman, Context API, Redux</w:t>
+      </w:r>
+    </w:p>
+    <w:p>
+      <w:pPr>
+        <w:rPr>
+          <w:rFonts w:ascii="Calibri" w:hAnsi="Calibri" w:eastAsia="ＭＳ ゴシック"/>
+          <w:b/>
+          <w:bCs/>
+          <w:color w:val="000000"/>
+        </w:rPr>
+      </w:pPr>
+      <w:r>
+        <w:rPr>
+          <w:rFonts w:ascii="Calibri" w:hAnsi="Calibri" w:eastAsia="ＭＳ ゴシック"/>
+          <w:b/>
+          <w:bCs/>
+          <w:color w:val="000000"/>
+        </w:rPr>
+        <w:t>Tools &amp; UI Design :</w:t>
+      </w:r>
+    </w:p>
+    <w:p>
+      <w:pPr>
+        <w:pBdr>
+          <w:top w:val="nil" w:sz="0" w:space="0" w:color="000000" tmln="20, 20, 20, 0, 0"/>
+          <w:left w:val="nil" w:sz="0" w:space="0" w:color="000000" tmln="20, 20, 20, 0, 0"/>
+          <w:bottom w:val="nil" w:sz="0" w:space="0" w:color="000000" tmln="20, 20, 20, 0, 0"/>
+          <w:right w:val="nil" w:sz="0" w:space="0" w:color="000000" tmln="20, 20, 20, 0, 0"/>
+          <w:between w:val="nil" w:sz="0" w:space="0" w:color="000000" tmln="20, 20, 20, 0, 0"/>
+        </w:pBdr>
+        <w:shd w:val="none"/>
+      </w:pPr>
+      <w:r>
+        <w:t>Git, GitHub, VS Code, Chrome DevTools, Vercel, WordPress, Figma, Adobe XD</w:t>
+      </w:r>
+    </w:p>
+    <w:p>
+      <w:pPr>
+        <w:rPr>
+          <w:b/>
+          <w:bCs/>
+          <w:sz w:val="24"/>
+          <w:szCs w:val="24"/>
+        </w:rPr>
+      </w:pPr>
+      <w:r>
+        <w:rPr>
+          <w:b/>
+          <w:bCs/>
+          <w:sz w:val="24"/>
+          <w:szCs w:val="24"/>
+        </w:rPr>
+        <w:t>Soft Skills</w:t>
+      </w:r>
+    </w:p>
+    <w:p>
+      <w:pPr>
+        <w:pBdr>
+          <w:top w:val="nil" w:sz="0" w:space="0" w:color="000000" tmln="20, 20, 20, 0, 0"/>
+          <w:left w:val="nil" w:sz="0" w:space="0" w:color="000000" tmln="20, 20, 20, 0, 0"/>
+          <w:bottom w:val="nil" w:sz="0" w:space="0" w:color="000000" tmln="20, 20, 20, 0, 0"/>
+          <w:right w:val="nil" w:sz="0" w:space="0" w:color="000000" tmln="20, 20, 20, 0, 0"/>
+          <w:between w:val="nil" w:sz="0" w:space="0" w:color="000000" tmln="20, 20, 20, 0, 0"/>
+        </w:pBdr>
+        <w:shd w:val="none"/>
+      </w:pPr>
+      <w:r>
+        <w:t>Teamwork, Communication, Problem Solving, Time Management, Attention to Detail</w:t>
+      </w:r>
+    </w:p>
+    <w:p>
+      <w:pPr>
+        <w:pBdr>
+          <w:top w:val="nil" w:sz="0" w:space="0" w:color="000000" tmln="20, 20, 20, 0, 0"/>
+          <w:left w:val="nil" w:sz="0" w:space="0" w:color="000000" tmln="20, 20, 20, 0, 0"/>
+          <w:bottom w:val="nil" w:sz="0" w:space="0" w:color="000000" tmln="20, 20, 20, 0, 0"/>
+          <w:right w:val="nil" w:sz="0" w:space="0" w:color="000000" tmln="20, 20, 20, 0, 0"/>
+          <w:between w:val="nil" w:sz="0" w:space="0" w:color="000000" tmln="20, 20, 20, 0, 0"/>
+        </w:pBdr>
+        <w:shd w:val="none"/>
+        <w:rPr>
+          <w:rFonts w:cs="Arial"/>
           <w:szCs w:val="32"/>
         </w:rPr>
       </w:pPr>
+      <w:r>
+        <w:rPr>
+          <w:rFonts w:ascii="Calibri" w:hAnsi="Calibri" w:eastAsia="ＭＳ ゴシック"/>
+          <w:b/>
+          <w:bCs/>
+          <w:color w:val="000000"/>
+          <w:sz w:val="24"/>
+          <w:szCs w:val="24"/>
+        </w:rPr>
+        <w:t xml:space="preserve">Languages   </w:t>
+        <w:br w:type="textWrapping"/>
+      </w:r>
       <w:r>
         <w:rPr>
           <w:rFonts w:cs="Arial"/>
@@ -1950,6 +2041,24 @@
       <w:lvlJc w:val="left"/>
       <w:pPr>
         <w:ind w:left="0" w:hanging="0"/>
+      </w:pPr>
+      <w:rPr>
+        <w:rFonts w:ascii="Wingdings" w:hAnsi="Wingdings" w:eastAsia="Wingdings" w:cs="Wingdings"/>
+      </w:rPr>
+    </w:lvl>
+  </w:abstractNum>
+  <w:abstractNum w:abstractNumId="17">
+    <w:multiLevelType w:val="singleLevel"/>
+    <w:name w:val="Bullet 17"/>
+    <w:lvl w:ilvl="0">
+      <w:numFmt w:val="bullet"/>
+      <w:lvlText w:val=""/>
+      <w:lvlJc w:val="left"/>
+      <w:pPr>
+        <w:tabs>
+          <w:tab w:val="num" w:pos="360"/>
+        </w:tabs>
+        <w:ind w:left="360" w:hanging="360"/>
       </w:pPr>
       <w:rPr>
         <w:rFonts w:ascii="Wingdings" w:hAnsi="Wingdings" w:eastAsia="Wingdings" w:cs="Wingdings"/>
@@ -2005,6 +2114,9 @@
     <w:abstractNumId w:val="16"/>
   </w:num>
   <w:num w:numId="17">
+    <w:abstractNumId w:val="17"/>
+  </w:num>
+  <w:num w:numId="18">
     <w:abstractNumId w:val="0"/>
   </w:num>
 </w:numbering>

</xml_diff>